<commit_message>
Extended abstract: remove infrastructural citizenship
Co-Authored-By: Claude Sonnet 5.5 <noreply@anthropic.com>
Claude-Session: https://claude.ai/code/session_01BZjJPdbxvnVxMrcgFoYMCh
</commit_message>
<xml_diff>
--- a/misq_si/MISQ_SI_Extended_Abstract_DRAFT.docx
+++ b/misq_si/MISQ_SI_Extended_Abstract_DRAFT.docx
@@ -105,7 +105,7 @@
           <w:b w:val="0"/>
           <w:i w:val="0"/>
         </w:rPr>
-        <w:t xml:space="preserve">Three literatures bear on the phenomenon. First, IS research on infrastructure treats it as an installed base that is shared, evolves, and becomes visible on breakdown (Star and Ruhleder 1996), and has explained how digital infrastructures grow through generative mechanisms (Henfridsson and Bygstad 2013). These accounts concern how infrastructure develops and is governed, not how a society uses it to defend an institution in a crisis. Second, research on digital collective action explains how personalized, platform-based communication can coordinate large publics without central organizations (Bennett and Segerberg 2012). That research has been built mostly on movements that aim to challenge or change existing arrangements. The Korean episode was a mobilization to </w:t>
+        <w:t xml:space="preserve">Two literatures bear on the phenomenon. First, IS research on infrastructure treats it as an installed base that is shared, evolves, and becomes visible on breakdown (Star and Ruhleder 1996), and has explained how digital infrastructures grow through generative mechanisms (Henfridsson and Bygstad 2013). These accounts concern how infrastructure develops and is governed, not how a society uses it to defend an institution in a crisis. Second, research on digital collective action explains how personalized, platform-based communication can coordinate large publics without central organizations (Bennett and Segerberg 2012). That research has been built mostly on movements that aim to challenge or change existing arrangements. The Korean episode was a mobilization to </w:t>
       </w:r>
       <w:r>
         <w:rPr>
@@ -119,7 +119,7 @@
           <w:b w:val="0"/>
           <w:i w:val="0"/>
         </w:rPr>
-        <w:t xml:space="preserve"> an institution, the National Assembly, against an attempt to suspend it, with a legislative vote as the decisive act. Whether the same logic applies is open.</w:t>
+        <w:t xml:space="preserve"> an institution, the National Assembly, against an attempt to suspend it, with a legislative vote as the decisive act. Whether the same logic applies is open. Neither literature addresses a digital infrastructure that is largely privately operated and that citizens use to broadcast, verify and coordinate in real time in defense of a representative institution. We therefore begin from participants' own categories and treat these literatures as points of contrast, not as lenses.</w:t>
       </w:r>
     </w:p>
     <w:p>
@@ -132,34 +132,7 @@
           <w:b w:val="0"/>
           <w:i w:val="0"/>
         </w:rPr>
-        <w:t xml:space="preserve">Third, work on </w:t>
-      </w:r>
-      <w:r>
-        <w:rPr>
-          <w:b w:val="0"/>
-          <w:i/>
-        </w:rPr>
-        <w:t>infrastructural citizenship</w:t>
-      </w:r>
-      <w:r>
-        <w:rPr>
-          <w:b w:val="0"/>
-          <w:i w:val="0"/>
-        </w:rPr>
-        <w:t xml:space="preserve"> in urban geography and development studies argues that citizenship is embodied in infrastructure: citizens meet the state materially through everyday access to public infrastructure, and the state plans for citizens through how it provides and maintains it (Lemanski 2019, and the volume she edited). This is the closest existing concept, and the reason to engage it. It is also the reason not to adopt it as our lens. Its home settings are mainly urban service provision, such as water, housing and sanitation, and its core relation is between citizens and a state that provides infrastructure. It does not address a digital infrastructure that is largely privately operated and used by citizens to broadcast, verify and coordinate in real time, and it does not address the defense of a representative institution. Applying the concept to Korea and finding that it fits, or fits partly, would be the kind of contextual adaptation that the special issue does not seek. We therefore use it only as a point of contrast. The study begins from participants' own categories, and the question we put to infrastructural citizenship at the end is where it helps and where it fails to explain what we find. We have not yet completed a review of the concept's use in IS and communication research [to do before submission].</w:t>
-      </w:r>
-    </w:p>
-    <w:p>
-      <w:pPr>
-        <w:spacing w:line="276" w:lineRule="auto" w:after="120" w:before="0"/>
-        <w:jc w:val="both"/>
-      </w:pPr>
-      <w:r>
-        <w:rPr>
-          <w:b w:val="0"/>
-          <w:i w:val="0"/>
-        </w:rPr>
-        <w:t>Our approach also follows the special issue's guidance. Rather than tailoring variables and relationships of a Western theory to a Korean setting (cf. Hong et al. 2014), we aim to build concepts from the phenomenon, and to say explicitly what they mean for theory (cf. Venkatesh 2025).</w:t>
+        <w:t>Our approach follows the special issue's guidance. Rather than tailoring variables and relationships of a Western theory to a Korean setting (cf. Hong et al. 2014), we aim to build concepts from the phenomenon, and to say explicitly what they mean for theory (cf. Venkatesh 2025).</w:t>
       </w:r>
     </w:p>
     <w:p>
@@ -373,7 +346,7 @@
           <w:b w:val="0"/>
           <w:i w:val="0"/>
         </w:rPr>
-        <w:t>The study asks what a distinctively Korean combination of history, infrastructure and institutions is, on its own terms, and what theory it requires. It is not an application of an existing theory to a new setting, and existing concepts, including infrastructural citizenship, enter only as points of contrast. As a Discovery Short Paper, the aim is a rich account and the concepts that emerge from it, as a basis for later theory and empirical work.</w:t>
+        <w:t>The study asks what a distinctively Korean combination of history, infrastructure and institutions is, on its own terms, and what theory it requires. It is not an application of an existing theory to a new setting, and existing concepts enter only as points of contrast. As a Discovery Short Paper, the aim is a rich account and the concepts that emerge from it, as a basis for later theory and empirical work.</w:t>
       </w:r>
     </w:p>
     <w:p>
@@ -531,36 +504,6 @@
           <w:sz w:val="19"/>
         </w:rPr>
         <w:t xml:space="preserve"> 25(1):111–136.</w:t>
-      </w:r>
-    </w:p>
-    <w:p>
-      <w:pPr>
-        <w:spacing w:line="252" w:lineRule="auto" w:after="40"/>
-        <w:ind w:left="576" w:hanging="576"/>
-      </w:pPr>
-      <w:r>
-        <w:rPr>
-          <w:b w:val="0"/>
-          <w:i w:val="0"/>
-          <w:sz w:val="19"/>
-        </w:rPr>
-        <w:t xml:space="preserve">Lemanski C, ed. (2019) </w:t>
-      </w:r>
-      <w:r>
-        <w:rPr>
-          <w:b w:val="0"/>
-          <w:i/>
-          <w:sz w:val="19"/>
-        </w:rPr>
-        <w:t>Citizenship and Infrastructure: Practices and Identities of Citizens and the State</w:t>
-      </w:r>
-      <w:r>
-        <w:rPr>
-          <w:b w:val="0"/>
-          <w:i w:val="0"/>
-          <w:sz w:val="19"/>
-        </w:rPr>
-        <w:t xml:space="preserve"> (Routledge, London). [See also Lemanski, C., Infrastructural citizenship: (de)constructing state–society relations; venue and year to be verified.]</w:t>
       </w:r>
     </w:p>
     <w:p>

</xml_diff>

<commit_message>
Extended abstract: add falsifiable propositions and wider episode comparison
Co-Authored-By: Claude Sonnet 5.5 <noreply@anthropic.com>
Claude-Session: https://claude.ai/code/session_01BZjJPdbxvnVxMrcgFoYMCh
</commit_message>
<xml_diff>
--- a/misq_si/MISQ_SI_Extended_Abstract_DRAFT.docx
+++ b/misq_si/MISQ_SI_Extended_Abstract_DRAFT.docx
@@ -158,7 +158,7 @@
           <w:b w:val="0"/>
           <w:i w:val="0"/>
         </w:rPr>
-        <w:t>(1) Through which channels did information, coordination and verification occur that night, and how did participants rely on them? (2) How do participants link their action to the history of democratization and to the infrastructure they used, and in what words? (3) Does mobilization speed differ across episodes in which commitment was similar but infrastructure differed, namely 1987 (about three weeks from the start of the protests on 10 June to the concession of 29 June), the 2016–17 candlelight protests [verify dates and milestones], and 2024 (hours)? (4) What concepts, grounded in these accounts, are needed to explain rapid collective action in defense of an institution, and what do they imply for IS theories of infrastructure and of digital collective action?</w:t>
+        <w:t>(1) Through which channels did information, coordination and verification occur that night, and how did participants rely on them? (2) How do participants link their action to the history of democratization and to the infrastructure they used, and in what words? (3) Does mobilization speed differ across episodes in which commitment was similar but infrastructure differed, for example 1987 (about three weeks from the start of the protests on 10 June to the concession of 29 June), 2002 and 2008 [verify which episodes and how online communities were used], the 2016–17 candlelight protests [verify dates and milestones], and 2024 (hours)? (4) What concepts, grounded in these accounts, are needed to explain rapid collective action in defense of an institution, and what do they imply for IS theories of infrastructure and of digital collective action?</w:t>
       </w:r>
     </w:p>
     <w:p>
@@ -171,7 +171,61 @@
           <w:b/>
           <w:i w:val="0"/>
         </w:rPr>
-        <w:t>4. Design</w:t>
+        <w:t>4. Propositions and design</w:t>
+      </w:r>
+    </w:p>
+    <w:p>
+      <w:pPr>
+        <w:spacing w:line="276" w:lineRule="auto" w:after="120" w:before="0"/>
+        <w:jc w:val="both"/>
+      </w:pPr>
+      <w:r>
+        <w:rPr>
+          <w:b w:val="0"/>
+          <w:i w:val="0"/>
+        </w:rPr>
+        <w:t xml:space="preserve">The conjecture in Section 1 implies two propositions that the evidence can contradict. </w:t>
+      </w:r>
+      <w:r>
+        <w:rPr>
+          <w:b w:val="0"/>
+          <w:i/>
+        </w:rPr>
+        <w:t>P1 (channel).</w:t>
+      </w:r>
+      <w:r>
+        <w:rPr>
+          <w:b w:val="0"/>
+          <w:i w:val="0"/>
+        </w:rPr>
+        <w:t xml:space="preserve"> Among people who went to the Assembly, a large share learned of the declaration, decided to go, or found out where to go and what was happening through live streams and social media, and the pattern differs by role and age. The proposition would be weakened if most participants report television, calls to family and friends, or party and union networks as their main channels. </w:t>
+      </w:r>
+      <w:r>
+        <w:rPr>
+          <w:b w:val="0"/>
+          <w:i/>
+        </w:rPr>
+        <w:t>P2 (speed under suddenness).</w:t>
+      </w:r>
+      <w:r>
+        <w:rPr>
+          <w:b w:val="0"/>
+          <w:i w:val="0"/>
+        </w:rPr>
+        <w:t xml:space="preserve"> The interval between the announcement and the arrival of large crowds was shorter than in earlier episodes with a comparable commitment to the cause, and the difference remains after allowing for the fact that earlier large protests were largely announced in advance whereas this one was not. We will therefore compare the speed of unannounced or short-notice mobilizations across periods as well as the major protests. If the comparison cannot separate the effect of infrastructure from the effect of suddenness and of the Assembly's institutional role, we will say so.</w:t>
+      </w:r>
+    </w:p>
+    <w:p>
+      <w:pPr>
+        <w:spacing w:line="276" w:lineRule="auto" w:after="120" w:before="0"/>
+        <w:jc w:val="both"/>
+      </w:pPr>
+      <w:r>
+        <w:rPr>
+          <w:b w:val="0"/>
+          <w:i w:val="0"/>
+        </w:rPr>
+        <w:t>The design is as follows.</w:t>
       </w:r>
     </w:p>
     <w:p>

</xml_diff>

<commit_message>
Extended abstract: media constraints, crisis media substitution, balanced streamer sampling
Co-Authored-By: Claude Sonnet 5.5 <noreply@anthropic.com>
Claude-Session: https://claude.ai/code/session_01BZjJPdbxvnVxMrcgFoYMCh
</commit_message>
<xml_diff>
--- a/misq_si/MISQ_SI_Extended_Abstract_DRAFT.docx
+++ b/misq_si/MISQ_SI_Extended_Abstract_DRAFT.docx
@@ -66,7 +66,7 @@
           <w:b w:val="0"/>
           <w:i w:val="0"/>
         </w:rPr>
-        <w:t>South Korea won its democracy through mass mobilization (the June Democratic Struggle of 1987, which led to direct presidential elections), and from the early 1990s it built national information infrastructure through successive state programs [confirm names, dates and budgets]. On the night of 3 December 2024, the president announced emergency martial law in a televised address at about 10:30 p.m. Through the night citizens converged on the National Assembly, and at about 1 a.m. on 4 December the Assembly voted 190 to 0 to overturn the decree [verify against Assembly records]. Accounts of that night give prominent roles to live-streamed video, rapid sharing on social media and online communities, and real-time broadcasts of troop movements [source each claim]. The decree was formally lifted a few hours later. The president was impeached on 14 December, and the Constitutional Court removed him on 4 April 2025 [verify].</w:t>
+        <w:t>South Korea won its democracy through mass mobilization (the June Democratic Struggle of 1987, which led to direct presidential elections), and from the early 1990s it built national information infrastructure through successive state programs [confirm names, dates and budgets]. On the night of 3 December 2024, the president announced emergency martial law in a televised address at about 10:30 p.m. Through the night citizens converged on the National Assembly, and at about 1 a.m. on 4 December the Assembly voted 190 to 0 to overturn the decree [verify against Assembly records]. Accounts of that night give prominent roles to live-streamed video, rapid sharing on social media and online communities, and real-time broadcasts of troop movements [source each claim]. The declaration itself was carried live on television, while the decree reportedly placed media and publications under the martial law command, and broadcasters reported interference with their coverage [verify each point against primary sources]. The decree was formally lifted a few hours later. The president was impeached on 14 December, and the Constitutional Court removed him on 4 April 2025 [verify].</w:t>
       </w:r>
     </w:p>
     <w:p>
@@ -198,7 +198,7 @@
           <w:b w:val="0"/>
           <w:i w:val="0"/>
         </w:rPr>
-        <w:t xml:space="preserve"> Among people who went to the Assembly, a large share learned of the declaration, decided to go, or found out where to go and what was happening through live streams and social media, and the pattern differs by role and age. The proposition would be weakened if most participants report television, calls to family and friends, or party and union networks as their main channels. </w:t>
+        <w:t xml:space="preserve"> Among people who went to the Assembly, a large share learned of the declaration, decided to go, or found out where to go and what was happening through live streams and social media, and the pattern differs by role and age. The proposition would be weakened if most participants report television, calls to family and friends, or party and union networks as their main channels, and strengthened if participants report that broadcast coverage was incomplete or constrained that night and that live streams supplied what they needed to decide. </w:t>
       </w:r>
       <w:r>
         <w:rPr>
@@ -266,7 +266,7 @@
           <w:b w:val="0"/>
           <w:i w:val="0"/>
         </w:rPr>
-        <w:t xml:space="preserve"> We plan [N] semi-structured interviews with people who went to the Assembly, people who streamed or relayed information, journalists, platform and telecommunications staff, and officials, selected to include different roles and political views [access to be secured; protection of participants is essential, and participants will not be asked to take political positions]. </w:t>
+        <w:t xml:space="preserve"> We plan [N] semi-structured interviews with people who went to the Assembly, people who streamed or relayed information, journalists, platform and telecommunications staff, and officials, selected to include different roles, audience sizes and political views, with streamers and relays from across the political spectrum and not only the best-known; we will not attribute the crowd's gathering to any single broadcaster or person without evidence [access to be secured; protection of participants is essential, and participants will not be asked to take political positions]. </w:t>
       </w:r>
       <w:r>
         <w:rPr>
@@ -319,7 +319,7 @@
           <w:b w:val="0"/>
           <w:i w:val="0"/>
         </w:rPr>
-        <w:t xml:space="preserve">The study could contribute concepts in three areas, each to be established or discarded by the evidence. (a) </w:t>
+        <w:t xml:space="preserve">The study could contribute concepts in four areas, each to be established or discarded by the evidence. (a) </w:t>
       </w:r>
       <w:r>
         <w:rPr>
@@ -348,6 +348,20 @@
           <w:i w:val="0"/>
         </w:rPr>
         <w:t xml:space="preserve"> If participants had to judge quickly which information was reliable, the study may reveal practices of collective verification that differ from the content-moderation framing common in platform research. (c) </w:t>
+      </w:r>
+      <w:r>
+        <w:rPr>
+          <w:b w:val="0"/>
+          <w:i/>
+        </w:rPr>
+        <w:t>Media substitution in crisis.</w:t>
+      </w:r>
+      <w:r>
+        <w:rPr>
+          <w:b w:val="0"/>
+          <w:i w:val="0"/>
+        </w:rPr>
+        <w:t xml:space="preserve"> Roughly half of Koreans use YouTube for news in a typical week (Reuters Institute Digital News Report 2025 [verify]), and its audience differs by age and political leaning. If audiences moved from broadcast to live streaming when broadcast was constrained, a concept of crisis-time substitution is needed that explains when and why it happens, and for whom. Whether live streaming has displaced television as a mass medium more generally is a separate question that we do not assume. (d) </w:t>
       </w:r>
       <w:r>
         <w:rPr>

</xml_diff>